<commit_message>
Implementacion de correccion en documento FD03
</commit_message>
<xml_diff>
--- a/Documents/FD02-EPIS-Informe Vision.docx
+++ b/Documents/FD02-EPIS-Informe Vision.docx
@@ -1670,7 +1670,31 @@
                 <w:sz w:val="14"/>
                 <w:szCs w:val="14"/>
               </w:rPr>
-              <w:t>10/10/2025</w:t>
+              <w:t>01</w:t>
+            </w:r>
+            <w:r>
+              <w:rPr>
+                <w:rFonts w:ascii="Bookman Old Style" w:eastAsia="Bookman Old Style" w:hAnsi="Bookman Old Style" w:cs="Bookman Old Style"/>
+                <w:sz w:val="14"/>
+                <w:szCs w:val="14"/>
+              </w:rPr>
+              <w:t>/</w:t>
+            </w:r>
+            <w:r>
+              <w:rPr>
+                <w:rFonts w:ascii="Bookman Old Style" w:eastAsia="Bookman Old Style" w:hAnsi="Bookman Old Style" w:cs="Bookman Old Style"/>
+                <w:sz w:val="14"/>
+                <w:szCs w:val="14"/>
+              </w:rPr>
+              <w:t>06</w:t>
+            </w:r>
+            <w:r>
+              <w:rPr>
+                <w:rFonts w:ascii="Bookman Old Style" w:eastAsia="Bookman Old Style" w:hAnsi="Bookman Old Style" w:cs="Bookman Old Style"/>
+                <w:sz w:val="14"/>
+                <w:szCs w:val="14"/>
+              </w:rPr>
+              <w:t>/2025</w:t>
             </w:r>
           </w:p>
         </w:tc>

</xml_diff>